<commit_message>
feat: add ZS Associates experience and update resume
</commit_message>
<xml_diff>
--- a/assets/Sanket_Repale_Resume.docx
+++ b/assets/Sanket_Repale_Resume.docx
@@ -45,10 +45,10 @@
         <w:rPr>
           <w:b/>
         </w:rPr>
-        <w:t>LTIMindtree</w:t>
+        <w:t>ZS Associates</w:t>
       </w:r>
       <w:r>
-        <w:t xml:space="preserve"> — Software Development Engineer in Test (May 2022 - Present)</w:t>
+        <w:t xml:space="preserve"> — Software Development Engineer in Test (May 2025 - Present)</w:t>
       </w:r>
     </w:p>
     <w:p>
@@ -56,7 +56,18 @@
         <w:pStyle w:val="ListBullet"/>
       </w:pPr>
       <w:r>
-        <w:t>• Spearheading the development of advanced Agentic AI-based automation testing frameworks for UI, API, ETL, and Performance testing, drastically improving coverage and intelligent test generation.</w:t>
+        <w:t>• Designing and implementing pioneering Agentic AI-based automation testing frameworks spanning UI, API, ETL, and Performance testing for next-generation product development, utilizing advanced AI backend systems to orchestrate autonomous test execution.</w:t>
+      </w:r>
+    </w:p>
+    <w:p>
+      <w:r>
+        <w:rPr>
+          <w:b/>
+        </w:rPr>
+        <w:t>LTIMindtree</w:t>
+      </w:r>
+      <w:r>
+        <w:t xml:space="preserve"> — Software Development Engineer in Test (May 2022 - May 2025)</w:t>
       </w:r>
     </w:p>
     <w:p>
@@ -64,7 +75,7 @@
         <w:pStyle w:val="ListBullet"/>
       </w:pPr>
       <w:r>
-        <w:t>• Designed and implemented scalable C# &amp; Selenium automated scripts utilizing the Page Object Model (POM), which reduced regression testing time by 75%.</w:t>
+        <w:t>• Spearheaded the development of highly scalable C# &amp; Selenium automated scripts utilizing the Page Object Model (POM), driving a 75% reduction in regression execution times.</w:t>
       </w:r>
     </w:p>
     <w:p>
@@ -72,15 +83,7 @@
         <w:pStyle w:val="ListBullet"/>
       </w:pPr>
       <w:r>
-        <w:t>• Actively involved in the full Software Testing Life Cycle (STLC), integrating test suites seamlessly into Azure DevOps CI/CD pipelines.</w:t>
-      </w:r>
-    </w:p>
-    <w:p>
-      <w:pPr>
-        <w:pStyle w:val="ListBullet"/>
-      </w:pPr>
-      <w:r>
-        <w:t>• Collaborated across Agile teams to ensure rigorous validation of RESTful and SOAP services.</w:t>
+        <w:t>• Actively managed end-to-end STLC processes, integrated test suites into Azure DevOps CI/CD pipelines, and collaborated extensively with Agile teams to guarantee flawless product deliveries.</w:t>
       </w:r>
     </w:p>
     <w:p>

</xml_diff>

<commit_message>
feat: ATS resume optimization and UI content rewrite
</commit_message>
<xml_diff>
--- a/assets/Sanket_Repale_Resume.docx
+++ b/assets/Sanket_Repale_Resume.docx
@@ -4,10 +4,13 @@
   <w:body>
     <w:p>
       <w:pPr>
-        <w:pStyle w:val="Title"/>
         <w:jc w:val="center"/>
       </w:pPr>
       <w:r>
+        <w:rPr>
+          <w:b/>
+          <w:sz w:val="40"/>
+        </w:rPr>
         <w:t>Sanket Prakash Repale</w:t>
       </w:r>
     </w:p>
@@ -16,28 +19,108 @@
         <w:jc w:val="center"/>
       </w:pPr>
       <w:r>
-        <w:t>sanketrepale123@gmail.com | (+91) 8452836416 | Pune, Maharashtra</w:t>
+        <w:t>sanketrepale123@gmail.com | (+91) 8452836416 | Pune, Maharashtra | linkedin.com/in/sanket-repale-521157287</w:t>
       </w:r>
     </w:p>
     <w:p>
       <w:pPr>
-        <w:pStyle w:val="Heading1"/>
+        <w:pBdr>
+          <w:bottom w:val="single" w:sz="6" w:space="1" w:color="auto"/>
+        </w:pBdr>
       </w:pPr>
       <w:r>
-        <w:t>Professional Summary</w:t>
+        <w:rPr>
+          <w:b/>
+          <w:color w:val="000000"/>
+          <w:sz w:val="28"/>
+        </w:rPr>
+        <w:t>PROFESSIONAL SUMMARY</w:t>
       </w:r>
     </w:p>
     <w:p>
       <w:r>
-        <w:t>Highly skilled Software Development Engineer in Test (SDET) with expertise in designing and maintaining robust, scalable automation testing frameworks. Currently leading initiatives in Agentic AI-based automation frameworks across UI, API, ETL, and Performance testing to accelerate delivery and ensure uncompromising software quality.</w:t>
+        <w:t>Highly skilled Software Development Engineer in Test (SDET) with a proven track record of designing, building, and maintaining robust, scalable automation testing frameworks. Currently leading pioneering initiatives in Agentic AI-based automation frameworks across UI, API, ETL, and Performance testing to radically accelerate delivery pipelines, minimize maintenance overhead, and ensure uncompromising software quality at an enterprise scale.</w:t>
       </w:r>
     </w:p>
     <w:p>
       <w:pPr>
-        <w:pStyle w:val="Heading1"/>
+        <w:pBdr>
+          <w:bottom w:val="single" w:sz="6" w:space="1" w:color="auto"/>
+        </w:pBdr>
       </w:pPr>
       <w:r>
-        <w:t>Experience</w:t>
+        <w:rPr>
+          <w:b/>
+          <w:color w:val="000000"/>
+          <w:sz w:val="28"/>
+        </w:rPr>
+        <w:t>TECHNICAL SKILLS</w:t>
+      </w:r>
+    </w:p>
+    <w:p>
+      <w:r>
+        <w:rPr>
+          <w:b/>
+        </w:rPr>
+        <w:t xml:space="preserve">UI Automation: </w:t>
+      </w:r>
+      <w:r>
+        <w:t>Selenium WebDriver, Playwright, SpecFlow BDD, NUnit</w:t>
+        <w:br/>
+      </w:r>
+      <w:r>
+        <w:rPr>
+          <w:b/>
+        </w:rPr>
+        <w:t xml:space="preserve">API &amp; Backend Testing: </w:t>
+      </w:r>
+      <w:r>
+        <w:t>Ready API, Postman, Pytest, RESTful &amp; SOAP Services</w:t>
+        <w:br/>
+      </w:r>
+      <w:r>
+        <w:rPr>
+          <w:b/>
+        </w:rPr>
+        <w:t xml:space="preserve">Programming Languages: </w:t>
+      </w:r>
+      <w:r>
+        <w:t>C# / .NET, Java, Python</w:t>
+        <w:br/>
+      </w:r>
+      <w:r>
+        <w:rPr>
+          <w:b/>
+        </w:rPr>
+        <w:t xml:space="preserve">CI/CD &amp; DevOps: </w:t>
+      </w:r>
+      <w:r>
+        <w:t>Azure DevOps, Git, CI/CD Pipeline Integration, Agile Scrum Methodologies</w:t>
+        <w:br/>
+      </w:r>
+      <w:r>
+        <w:rPr>
+          <w:b/>
+        </w:rPr>
+        <w:t xml:space="preserve">Advanced Technologies: </w:t>
+      </w:r>
+      <w:r>
+        <w:t>Agentic AI Automation, ETL Data Validation, Performance Testing Strategies</w:t>
+      </w:r>
+    </w:p>
+    <w:p>
+      <w:pPr>
+        <w:pBdr>
+          <w:bottom w:val="single" w:sz="6" w:space="1" w:color="auto"/>
+        </w:pBdr>
+      </w:pPr>
+      <w:r>
+        <w:rPr>
+          <w:b/>
+          <w:color w:val="000000"/>
+          <w:sz w:val="28"/>
+        </w:rPr>
+        <w:t>PROFESSIONAL EXPERIENCE</w:t>
       </w:r>
     </w:p>
     <w:p>
@@ -48,7 +131,27 @@
         <w:t>ZS Associates</w:t>
       </w:r>
       <w:r>
-        <w:t xml:space="preserve"> — Software Development Engineer in Test (May 2025 - Present)</w:t>
+        <w:tab/>
+        <w:tab/>
+        <w:tab/>
+        <w:tab/>
+        <w:tab/>
+        <w:tab/>
+        <w:t>Pune, Maharashtra</w:t>
+        <w:br/>
+      </w:r>
+      <w:r>
+        <w:rPr>
+          <w:i/>
+        </w:rPr>
+        <w:t>Software Development Engineer in Test</w:t>
+      </w:r>
+      <w:r>
+        <w:tab/>
+        <w:tab/>
+        <w:tab/>
+        <w:tab/>
+        <w:t>May 2025 – Present</w:t>
       </w:r>
     </w:p>
     <w:p>
@@ -56,7 +159,23 @@
         <w:pStyle w:val="ListBullet"/>
       </w:pPr>
       <w:r>
-        <w:t>• Designing and implementing pioneering Agentic AI-based automation testing frameworks spanning UI, API, ETL, and Performance testing for next-generation product development, utilizing advanced AI backend systems to orchestrate autonomous test execution.</w:t>
+        <w:t>Spearheading the architecture and implementation of next-generation Agentic AI-based automation testing frameworks spanning UI, API, ETL, and Performance layers.</w:t>
+      </w:r>
+    </w:p>
+    <w:p>
+      <w:pPr>
+        <w:pStyle w:val="ListBullet"/>
+      </w:pPr>
+      <w:r>
+        <w:t>Orchestrating autonomous test generation and execution utilizing advanced AI backend systems, drastically reducing test maintenance and scripting overhead.</w:t>
+      </w:r>
+    </w:p>
+    <w:p>
+      <w:pPr>
+        <w:pStyle w:val="ListBullet"/>
+      </w:pPr>
+      <w:r>
+        <w:t>Leading product development integration, ensuring seamless interaction between AI capabilities and legacy enterprise testing environments.</w:t>
       </w:r>
     </w:p>
     <w:p>
@@ -67,7 +186,27 @@
         <w:t>LTIMindtree</w:t>
       </w:r>
       <w:r>
-        <w:t xml:space="preserve"> — Software Development Engineer in Test (May 2022 - May 2025)</w:t>
+        <w:tab/>
+        <w:tab/>
+        <w:tab/>
+        <w:tab/>
+        <w:tab/>
+        <w:tab/>
+        <w:t>Pune, Maharashtra</w:t>
+        <w:br/>
+      </w:r>
+      <w:r>
+        <w:rPr>
+          <w:i/>
+        </w:rPr>
+        <w:t>Software Development Engineer in Test</w:t>
+      </w:r>
+      <w:r>
+        <w:tab/>
+        <w:tab/>
+        <w:tab/>
+        <w:tab/>
+        <w:t>May 2022 – May 2025</w:t>
       </w:r>
     </w:p>
     <w:p>
@@ -75,7 +214,7 @@
         <w:pStyle w:val="ListBullet"/>
       </w:pPr>
       <w:r>
-        <w:t>• Spearheaded the development of highly scalable C# &amp; Selenium automated scripts utilizing the Page Object Model (POM), driving a 75% reduction in regression execution times.</w:t>
+        <w:t>Engineered and deployed highly scalable automated test scripts using C# and Selenium based on the Page Object Model (POM) design pattern.</w:t>
       </w:r>
     </w:p>
     <w:p>
@@ -83,15 +222,7 @@
         <w:pStyle w:val="ListBullet"/>
       </w:pPr>
       <w:r>
-        <w:t>• Actively managed end-to-end STLC processes, integrated test suites into Azure DevOps CI/CD pipelines, and collaborated extensively with Agile teams to guarantee flawless product deliveries.</w:t>
-      </w:r>
-    </w:p>
-    <w:p>
-      <w:pPr>
-        <w:pStyle w:val="Heading1"/>
-      </w:pPr>
-      <w:r>
-        <w:t>Certifications &amp; Awards</w:t>
+        <w:t>Optimized regression test execution cycles, successfully driving a 75% reduction in overall regression testing times and enabling faster release cadences.</w:t>
       </w:r>
     </w:p>
     <w:p>
@@ -99,7 +230,7 @@
         <w:pStyle w:val="ListBullet"/>
       </w:pPr>
       <w:r>
-        <w:t>• Certifications: AZ-900 (Azure Fundamentals), Playwright Automation, Selenium Masterclass, Ready API, and Generative AI tools.</w:t>
+        <w:t>Actively managed end-to-end Software Testing Life Cycle (STLC) processes from requirement analysis to test planning and final execution.</w:t>
       </w:r>
     </w:p>
     <w:p>
@@ -107,15 +238,22 @@
         <w:pStyle w:val="ListBullet"/>
       </w:pPr>
       <w:r>
-        <w:t>• Awards: Shooting Star Award, Team Player Award, and Super Crew Award for outstanding deliveries and client impact.</w:t>
+        <w:t>Integrated comprehensive test suites directly into Azure DevOps CI/CD pipelines to guarantee automated deployment validation and flawless product deliveries.</w:t>
       </w:r>
     </w:p>
     <w:p>
       <w:pPr>
-        <w:pStyle w:val="Heading1"/>
+        <w:pBdr>
+          <w:bottom w:val="single" w:sz="6" w:space="1" w:color="auto"/>
+        </w:pBdr>
       </w:pPr>
       <w:r>
-        <w:t>Technical Skills</w:t>
+        <w:rPr>
+          <w:b/>
+          <w:color w:val="000000"/>
+          <w:sz w:val="28"/>
+        </w:rPr>
+        <w:t>CERTIFICATIONS &amp; AWARDS</w:t>
       </w:r>
     </w:p>
     <w:p>
@@ -123,7 +261,7 @@
         <w:pStyle w:val="ListBullet"/>
       </w:pPr>
       <w:r>
-        <w:t>• UI Automation: Selenium, Playwright, SpecFlow BDD, NUnit</w:t>
+        <w:t>Certifications: AZ-900 (Microsoft Azure Fundamentals), Playwright Automation, Selenium Masterclass, Ready API, and Generative AI for Software Testing.</w:t>
       </w:r>
     </w:p>
     <w:p>
@@ -131,20 +269,12 @@
         <w:pStyle w:val="ListBullet"/>
       </w:pPr>
       <w:r>
-        <w:t>• API Testing: Ready API, Postman, Pytest</w:t>
-      </w:r>
-    </w:p>
-    <w:p>
-      <w:pPr>
-        <w:pStyle w:val="ListBullet"/>
-      </w:pPr>
-      <w:r>
-        <w:t>• Development &amp; CI/CD: C#, Java, Python, Azure DevOps, Git, Agile Scrum</w:t>
+        <w:t>Awards: Shooting Star Award, Team Player Award, and Super Crew Award recognized by leadership and clients for outstanding project deliveries and profound technical impact.</w:t>
       </w:r>
     </w:p>
     <w:sectPr>
       <w:pgSz w:w="12240" w:h="15840"/>
-      <w:pgMar w:top="1440" w:right="1800" w:bottom="1440" w:left="1800" w:header="720" w:footer="720" w:gutter="0"/>
+      <w:pgMar w:top="720" w:right="1080" w:bottom="720" w:left="1080" w:header="720" w:footer="720" w:gutter="0"/>
       <w:cols w:space="720"/>
       <w:docGrid w:linePitch="360"/>
     </w:sectPr>
@@ -515,6 +645,10 @@
     <w:name w:val="Normal"/>
     <w:qFormat/>
     <w:rsid w:val="00FC693F"/>
+    <w:rPr>
+      <w:rFonts w:ascii="Calibri" w:hAnsi="Calibri"/>
+      <w:sz w:val="22"/>
+    </w:rPr>
   </w:style>
   <w:style w:type="paragraph" w:styleId="Header">
     <w:name w:val="header"/>

</xml_diff>

<commit_message>
feat: premium ATS resume with dark header banner, expanded website content
</commit_message>
<xml_diff>
--- a/assets/Sanket_Repale_Resume.docx
+++ b/assets/Sanket_Repale_Resume.docx
@@ -2,151 +2,312 @@
 <file path=word/document.xml><?xml version="1.0" encoding="utf-8"?>
 <w:document xmlns:wpc="http://schemas.microsoft.com/office/word/2010/wordprocessingCanvas" xmlns:mo="http://schemas.microsoft.com/office/mac/office/2008/main" xmlns:mc="http://schemas.openxmlformats.org/markup-compatibility/2006" xmlns:mv="urn:schemas-microsoft-com:mac:vml" xmlns:o="urn:schemas-microsoft-com:office:office" xmlns:r="http://schemas.openxmlformats.org/officeDocument/2006/relationships" xmlns:m="http://schemas.openxmlformats.org/officeDocument/2006/math" xmlns:v="urn:schemas-microsoft-com:vml" xmlns:wp14="http://schemas.microsoft.com/office/word/2010/wordprocessingDrawing" xmlns:wp="http://schemas.openxmlformats.org/drawingml/2006/wordprocessingDrawing" xmlns:w10="urn:schemas-microsoft-com:office:word" xmlns:w="http://schemas.openxmlformats.org/wordprocessingml/2006/main" xmlns:w14="http://schemas.microsoft.com/office/word/2010/wordml" xmlns:wpg="http://schemas.microsoft.com/office/word/2010/wordprocessingGroup" xmlns:wpi="http://schemas.microsoft.com/office/word/2010/wordprocessingInk" xmlns:wne="http://schemas.microsoft.com/office/word/2006/wordml" xmlns:wps="http://schemas.microsoft.com/office/word/2010/wordprocessingShape" mc:Ignorable="w14 wp14">
   <w:body>
+    <w:tbl>
+      <w:tblPr>
+        <w:tblW w:type="auto" w:w="0"/>
+        <w:jc w:val="center"/>
+        <w:tblLook w:firstColumn="1" w:firstRow="1" w:lastColumn="0" w:lastRow="0" w:noHBand="0" w:noVBand="1" w:val="04A0"/>
+      </w:tblPr>
+      <w:tblGrid>
+        <w:gridCol w:w="10224"/>
+      </w:tblGrid>
+      <w:tr>
+        <w:tc>
+          <w:tcPr>
+            <w:tcW w:type="dxa" w:w="10224"/>
+            <w:shd w:fill="1A1A2E" w:val="clear"/>
+            <w:tcBorders>
+              <w:top w:val="none" w:sz="0" w:color="1A1A2E" w:space="0"/>
+              <w:bottom w:val="none" w:sz="0" w:color="1A1A2E" w:space="0"/>
+              <w:start w:val="none" w:sz="0" w:color="1A1A2E" w:space="0"/>
+              <w:end w:val="none" w:sz="0" w:color="1A1A2E" w:space="0"/>
+            </w:tcBorders>
+          </w:tcPr>
+          <w:p>
+            <w:pPr>
+              <w:jc w:val="center"/>
+              <w:spacing w:before="120" w:after="0"/>
+            </w:pPr>
+            <w:r>
+              <w:rPr>
+                <w:rFonts w:ascii="Calibri" w:hAnsi="Calibri"/>
+                <w:b/>
+                <w:color w:val="FFFFFF"/>
+                <w:sz w:val="44"/>
+              </w:rPr>
+              <w:t>SANKET PRAKASH REPALE</w:t>
+            </w:r>
+          </w:p>
+          <w:p>
+            <w:pPr>
+              <w:jc w:val="center"/>
+              <w:spacing w:before="40" w:after="0"/>
+            </w:pPr>
+            <w:r>
+              <w:rPr>
+                <w:rFonts w:ascii="Calibri" w:hAnsi="Calibri"/>
+                <w:color w:val="00D4AA"/>
+                <w:sz w:val="22"/>
+              </w:rPr>
+              <w:t>Software Development Engineer in Test</w:t>
+            </w:r>
+          </w:p>
+          <w:p>
+            <w:pPr>
+              <w:jc w:val="center"/>
+              <w:spacing w:before="60" w:after="120"/>
+            </w:pPr>
+            <w:r>
+              <w:rPr>
+                <w:rFonts w:ascii="Calibri" w:hAnsi="Calibri"/>
+                <w:color w:val="BBBBCC"/>
+                <w:sz w:val="18"/>
+              </w:rPr>
+              <w:t>✉  sanketrepale123@gmail.com   |   ✆  (+91) 8452836416   |   ⌂  Pune, Maharashtra   |   🔗 linkedin.com/in/sanket-repale-521157287</w:t>
+            </w:r>
+          </w:p>
+        </w:tc>
+      </w:tr>
+    </w:tbl>
     <w:p>
       <w:pPr>
-        <w:jc w:val="center"/>
-      </w:pPr>
-      <w:r>
-        <w:rPr>
-          <w:b/>
-          <w:sz w:val="40"/>
-        </w:rPr>
-        <w:t>Sanket Prakash Repale</w:t>
-      </w:r>
-    </w:p>
-    <w:p>
-      <w:pPr>
-        <w:jc w:val="center"/>
-      </w:pPr>
-      <w:r>
-        <w:t>sanketrepale123@gmail.com | (+91) 8452836416 | Pune, Maharashtra | linkedin.com/in/sanket-repale-521157287</w:t>
-      </w:r>
-    </w:p>
-    <w:p>
-      <w:pPr>
+        <w:spacing w:before="200" w:after="80"/>
         <w:pBdr>
-          <w:bottom w:val="single" w:sz="6" w:space="1" w:color="auto"/>
+          <w:bottom w:val="single" w:sz="4" w:space="4" w:color="009688"/>
         </w:pBdr>
       </w:pPr>
       <w:r>
         <w:rPr>
+          <w:rFonts w:ascii="Calibri" w:hAnsi="Calibri"/>
           <w:b/>
-          <w:color w:val="000000"/>
-          <w:sz w:val="28"/>
+          <w:color w:val="009688"/>
+          <w:sz w:val="24"/>
+          <w:spacing w:val="60"/>
         </w:rPr>
         <w:t>PROFESSIONAL SUMMARY</w:t>
       </w:r>
     </w:p>
     <w:p>
+      <w:pPr>
+        <w:spacing w:before="40" w:after="80"/>
+      </w:pPr>
       <w:r>
-        <w:t>Highly skilled Software Development Engineer in Test (SDET) with a proven track record of designing, building, and maintaining robust, scalable automation testing frameworks. Currently leading pioneering initiatives in Agentic AI-based automation frameworks across UI, API, ETL, and Performance testing to radically accelerate delivery pipelines, minimize maintenance overhead, and ensure uncompromising software quality at an enterprise scale.</w:t>
+        <w:rPr>
+          <w:rFonts w:ascii="Calibri" w:hAnsi="Calibri"/>
+          <w:color w:val="5A5A6E"/>
+          <w:sz w:val="21"/>
+        </w:rPr>
+        <w:t>Results-driven Software Development Engineer in Test (SDET) with 3+ years of hands-on experience designing, building, and maintaining robust, scalable automation testing frameworks across enterprise-grade products. Currently spearheading cutting-edge Agentic AI-based autonomous testing initiatives spanning UI, API, ETL, and Performance testing, delivering measurable improvements in test coverage, execution speed, and release confidence. Proven ability to integrate test automation into CI/CD pipelines, mentor cross-functional Agile teams, and drive a culture of quality-first software delivery.</w:t>
       </w:r>
     </w:p>
     <w:p>
       <w:pPr>
+        <w:spacing w:before="200" w:after="80"/>
         <w:pBdr>
-          <w:bottom w:val="single" w:sz="6" w:space="1" w:color="auto"/>
+          <w:bottom w:val="single" w:sz="4" w:space="4" w:color="009688"/>
         </w:pBdr>
       </w:pPr>
       <w:r>
         <w:rPr>
+          <w:rFonts w:ascii="Calibri" w:hAnsi="Calibri"/>
           <w:b/>
-          <w:color w:val="000000"/>
-          <w:sz w:val="28"/>
+          <w:color w:val="009688"/>
+          <w:sz w:val="24"/>
+          <w:spacing w:val="60"/>
         </w:rPr>
         <w:t>TECHNICAL SKILLS</w:t>
       </w:r>
     </w:p>
     <w:p>
+      <w:pPr>
+        <w:spacing w:before="30" w:after="30"/>
+      </w:pPr>
       <w:r>
         <w:rPr>
+          <w:rFonts w:ascii="Calibri" w:hAnsi="Calibri"/>
           <w:b/>
+          <w:color w:val="1A1A2E"/>
+          <w:sz w:val="21"/>
         </w:rPr>
-        <w:t xml:space="preserve">UI Automation: </w:t>
-      </w:r>
-      <w:r>
-        <w:t>Selenium WebDriver, Playwright, SpecFlow BDD, NUnit</w:t>
-        <w:br/>
+        <w:t xml:space="preserve">Test Automation:  </w:t>
       </w:r>
       <w:r>
         <w:rPr>
-          <w:b/>
+          <w:rFonts w:ascii="Calibri" w:hAnsi="Calibri"/>
+          <w:color w:val="5A5A6E"/>
+          <w:sz w:val="21"/>
         </w:rPr>
-        <w:t xml:space="preserve">API &amp; Backend Testing: </w:t>
-      </w:r>
-      <w:r>
-        <w:t>Ready API, Postman, Pytest, RESTful &amp; SOAP Services</w:t>
-        <w:br/>
-      </w:r>
-      <w:r>
-        <w:rPr>
-          <w:b/>
-        </w:rPr>
-        <w:t xml:space="preserve">Programming Languages: </w:t>
-      </w:r>
-      <w:r>
-        <w:t>C# / .NET, Java, Python</w:t>
-        <w:br/>
-      </w:r>
-      <w:r>
-        <w:rPr>
-          <w:b/>
-        </w:rPr>
-        <w:t xml:space="preserve">CI/CD &amp; DevOps: </w:t>
-      </w:r>
-      <w:r>
-        <w:t>Azure DevOps, Git, CI/CD Pipeline Integration, Agile Scrum Methodologies</w:t>
-        <w:br/>
-      </w:r>
-      <w:r>
-        <w:rPr>
-          <w:b/>
-        </w:rPr>
-        <w:t xml:space="preserve">Advanced Technologies: </w:t>
-      </w:r>
-      <w:r>
-        <w:t>Agentic AI Automation, ETL Data Validation, Performance Testing Strategies</w:t>
+        <w:t>Selenium WebDriver, Playwright, SpecFlow BDD, NUnit, TestNG</w:t>
       </w:r>
     </w:p>
     <w:p>
       <w:pPr>
+        <w:spacing w:before="30" w:after="30"/>
+      </w:pPr>
+      <w:r>
+        <w:rPr>
+          <w:rFonts w:ascii="Calibri" w:hAnsi="Calibri"/>
+          <w:b/>
+          <w:color w:val="1A1A2E"/>
+          <w:sz w:val="21"/>
+        </w:rPr>
+        <w:t xml:space="preserve">API &amp; Service Testing:  </w:t>
+      </w:r>
+      <w:r>
+        <w:rPr>
+          <w:rFonts w:ascii="Calibri" w:hAnsi="Calibri"/>
+          <w:color w:val="5A5A6E"/>
+          <w:sz w:val="21"/>
+        </w:rPr>
+        <w:t>Ready API, Postman, Pytest, REST &amp; SOAP Validation</w:t>
+      </w:r>
+    </w:p>
+    <w:p>
+      <w:pPr>
+        <w:spacing w:before="30" w:after="30"/>
+      </w:pPr>
+      <w:r>
+        <w:rPr>
+          <w:rFonts w:ascii="Calibri" w:hAnsi="Calibri"/>
+          <w:b/>
+          <w:color w:val="1A1A2E"/>
+          <w:sz w:val="21"/>
+        </w:rPr>
+        <w:t xml:space="preserve">Languages:  </w:t>
+      </w:r>
+      <w:r>
+        <w:rPr>
+          <w:rFonts w:ascii="Calibri" w:hAnsi="Calibri"/>
+          <w:color w:val="5A5A6E"/>
+          <w:sz w:val="21"/>
+        </w:rPr>
+        <w:t>C# / .NET, Java, Python, SQL</w:t>
+      </w:r>
+    </w:p>
+    <w:p>
+      <w:pPr>
+        <w:spacing w:before="30" w:after="30"/>
+      </w:pPr>
+      <w:r>
+        <w:rPr>
+          <w:rFonts w:ascii="Calibri" w:hAnsi="Calibri"/>
+          <w:b/>
+          <w:color w:val="1A1A2E"/>
+          <w:sz w:val="21"/>
+        </w:rPr>
+        <w:t xml:space="preserve">CI/CD &amp; DevOps:  </w:t>
+      </w:r>
+      <w:r>
+        <w:rPr>
+          <w:rFonts w:ascii="Calibri" w:hAnsi="Calibri"/>
+          <w:color w:val="5A5A6E"/>
+          <w:sz w:val="21"/>
+        </w:rPr>
+        <w:t>Azure DevOps Pipelines, Git, Jenkins, Agile Scrum, Kanban</w:t>
+      </w:r>
+    </w:p>
+    <w:p>
+      <w:pPr>
+        <w:spacing w:before="30" w:after="30"/>
+      </w:pPr>
+      <w:r>
+        <w:rPr>
+          <w:rFonts w:ascii="Calibri" w:hAnsi="Calibri"/>
+          <w:b/>
+          <w:color w:val="1A1A2E"/>
+          <w:sz w:val="21"/>
+        </w:rPr>
+        <w:t xml:space="preserve">AI &amp; Advanced:  </w:t>
+      </w:r>
+      <w:r>
+        <w:rPr>
+          <w:rFonts w:ascii="Calibri" w:hAnsi="Calibri"/>
+          <w:color w:val="5A5A6E"/>
+          <w:sz w:val="21"/>
+        </w:rPr>
+        <w:t>Agentic AI Frameworks, ETL Data Validation, Performance &amp; Load Testing</w:t>
+      </w:r>
+    </w:p>
+    <w:p>
+      <w:pPr>
+        <w:spacing w:before="30" w:after="30"/>
+      </w:pPr>
+      <w:r>
+        <w:rPr>
+          <w:rFonts w:ascii="Calibri" w:hAnsi="Calibri"/>
+          <w:b/>
+          <w:color w:val="1A1A2E"/>
+          <w:sz w:val="21"/>
+        </w:rPr>
+        <w:t xml:space="preserve">Tools &amp; Platforms:  </w:t>
+      </w:r>
+      <w:r>
+        <w:rPr>
+          <w:rFonts w:ascii="Calibri" w:hAnsi="Calibri"/>
+          <w:color w:val="5A5A6E"/>
+          <w:sz w:val="21"/>
+        </w:rPr>
+        <w:t>Visual Studio, VS Code, JIRA, Confluence, Azure Cloud (AZ-900)</w:t>
+      </w:r>
+    </w:p>
+    <w:p>
+      <w:pPr>
+        <w:spacing w:before="200" w:after="80"/>
         <w:pBdr>
-          <w:bottom w:val="single" w:sz="6" w:space="1" w:color="auto"/>
+          <w:bottom w:val="single" w:sz="4" w:space="4" w:color="009688"/>
         </w:pBdr>
       </w:pPr>
       <w:r>
         <w:rPr>
+          <w:rFonts w:ascii="Calibri" w:hAnsi="Calibri"/>
           <w:b/>
-          <w:color w:val="000000"/>
-          <w:sz w:val="28"/>
+          <w:color w:val="009688"/>
+          <w:sz w:val="24"/>
+          <w:spacing w:val="60"/>
         </w:rPr>
         <w:t>PROFESSIONAL EXPERIENCE</w:t>
       </w:r>
     </w:p>
     <w:p>
+      <w:pPr>
+        <w:spacing w:before="80" w:after="0"/>
+      </w:pPr>
       <w:r>
         <w:rPr>
+          <w:rFonts w:ascii="Calibri" w:hAnsi="Calibri"/>
           <w:b/>
+          <w:color w:val="1A1A2E"/>
+          <w:sz w:val="24"/>
         </w:rPr>
         <w:t>ZS Associates</w:t>
       </w:r>
       <w:r>
-        <w:tab/>
-        <w:tab/>
-        <w:tab/>
-        <w:tab/>
-        <w:tab/>
-        <w:tab/>
-        <w:t>Pune, Maharashtra</w:t>
-        <w:br/>
+        <w:rPr>
+          <w:color w:val="5A5A6E"/>
+        </w:rPr>
+        <w:t xml:space="preserve">  —  Pune, Maharashtra</w:t>
       </w:r>
+    </w:p>
+    <w:p>
+      <w:pPr>
+        <w:spacing w:before="0" w:after="40"/>
+      </w:pPr>
       <w:r>
         <w:rPr>
+          <w:rFonts w:ascii="Calibri" w:hAnsi="Calibri"/>
           <w:i/>
+          <w:color w:val="1A1A2E"/>
+          <w:sz w:val="21"/>
         </w:rPr>
         <w:t>Software Development Engineer in Test</w:t>
       </w:r>
       <w:r>
+        <w:rPr>
+          <w:b/>
+          <w:color w:val="009688"/>
+          <w:sz w:val="20"/>
+        </w:rPr>
+        <w:tab/>
         <w:tab/>
         <w:tab/>
         <w:tab/>
@@ -157,51 +318,99 @@
     <w:p>
       <w:pPr>
         <w:pStyle w:val="ListBullet"/>
+        <w:spacing w:before="20" w:after="20"/>
       </w:pPr>
       <w:r>
-        <w:t>Spearheading the architecture and implementation of next-generation Agentic AI-based automation testing frameworks spanning UI, API, ETL, and Performance layers.</w:t>
+        <w:rPr>
+          <w:rFonts w:ascii="Calibri" w:hAnsi="Calibri"/>
+          <w:color w:val="5A5A6E"/>
+          <w:sz w:val="21"/>
+        </w:rPr>
+        <w:t>Architecting and implementing next-generation Agentic AI-based automation testing frameworks spanning UI, API, ETL, and Performance testing layers for enterprise-scale product development.</w:t>
       </w:r>
     </w:p>
     <w:p>
       <w:pPr>
         <w:pStyle w:val="ListBullet"/>
+        <w:spacing w:before="20" w:after="20"/>
       </w:pPr>
       <w:r>
-        <w:t>Orchestrating autonomous test generation and execution utilizing advanced AI backend systems, drastically reducing test maintenance and scripting overhead.</w:t>
+        <w:rPr>
+          <w:rFonts w:ascii="Calibri" w:hAnsi="Calibri"/>
+          <w:color w:val="5A5A6E"/>
+          <w:sz w:val="21"/>
+        </w:rPr>
+        <w:t>Orchestrating autonomous test generation and intelligent test execution utilizing advanced AI backend systems, reducing manual test scripting effort by an estimated 60%.</w:t>
       </w:r>
     </w:p>
     <w:p>
       <w:pPr>
         <w:pStyle w:val="ListBullet"/>
+        <w:spacing w:before="20" w:after="20"/>
       </w:pPr>
       <w:r>
-        <w:t>Leading product development integration, ensuring seamless interaction between AI capabilities and legacy enterprise testing environments.</w:t>
+        <w:rPr>
+          <w:rFonts w:ascii="Calibri" w:hAnsi="Calibri"/>
+          <w:color w:val="5A5A6E"/>
+          <w:sz w:val="21"/>
+        </w:rPr>
+        <w:t>Implementing self-healing test capabilities powered by AI agents that autonomously detect and adapt to UI/API changes, drastically minimizing test maintenance overhead.</w:t>
       </w:r>
     </w:p>
     <w:p>
+      <w:pPr>
+        <w:pStyle w:val="ListBullet"/>
+        <w:spacing w:before="20" w:after="20"/>
+      </w:pPr>
       <w:r>
         <w:rPr>
+          <w:rFonts w:ascii="Calibri" w:hAnsi="Calibri"/>
+          <w:color w:val="5A5A6E"/>
+          <w:sz w:val="21"/>
+        </w:rPr>
+        <w:t>Leading cross-team integration efforts to ensure seamless interaction between AI-driven testing capabilities and legacy enterprise testing environments.</w:t>
+      </w:r>
+    </w:p>
+    <w:p>
+      <w:pPr>
+        <w:spacing w:before="140" w:after="0"/>
+      </w:pPr>
+      <w:r>
+        <w:rPr>
+          <w:rFonts w:ascii="Calibri" w:hAnsi="Calibri"/>
           <w:b/>
+          <w:color w:val="1A1A2E"/>
+          <w:sz w:val="24"/>
         </w:rPr>
         <w:t>LTIMindtree</w:t>
       </w:r>
       <w:r>
-        <w:tab/>
-        <w:tab/>
-        <w:tab/>
-        <w:tab/>
-        <w:tab/>
-        <w:tab/>
-        <w:t>Pune, Maharashtra</w:t>
-        <w:br/>
+        <w:rPr>
+          <w:color w:val="5A5A6E"/>
+        </w:rPr>
+        <w:t xml:space="preserve">  —  Pune, Maharashtra</w:t>
       </w:r>
+    </w:p>
+    <w:p>
+      <w:pPr>
+        <w:spacing w:before="0" w:after="40"/>
+      </w:pPr>
       <w:r>
         <w:rPr>
+          <w:rFonts w:ascii="Calibri" w:hAnsi="Calibri"/>
           <w:i/>
+          <w:color w:val="1A1A2E"/>
+          <w:sz w:val="21"/>
         </w:rPr>
         <w:t>Software Development Engineer in Test</w:t>
       </w:r>
       <w:r>
+        <w:rPr>
+          <w:b/>
+          <w:color w:val="009688"/>
+          <w:sz w:val="20"/>
+        </w:rPr>
+        <w:tab/>
         <w:tab/>
         <w:tab/>
         <w:tab/>
@@ -212,69 +421,251 @@
     <w:p>
       <w:pPr>
         <w:pStyle w:val="ListBullet"/>
+        <w:spacing w:before="20" w:after="20"/>
       </w:pPr>
       <w:r>
-        <w:t>Engineered and deployed highly scalable automated test scripts using C# and Selenium based on the Page Object Model (POM) design pattern.</w:t>
+        <w:rPr>
+          <w:rFonts w:ascii="Calibri" w:hAnsi="Calibri"/>
+          <w:color w:val="5A5A6E"/>
+          <w:sz w:val="21"/>
+        </w:rPr>
+        <w:t>Engineered and deployed highly scalable automated test scripts using C# and Selenium WebDriver based on the Page Object Model (POM) design pattern, ensuring maximum code reusability and maintainability.</w:t>
       </w:r>
     </w:p>
     <w:p>
       <w:pPr>
         <w:pStyle w:val="ListBullet"/>
+        <w:spacing w:before="20" w:after="20"/>
       </w:pPr>
       <w:r>
-        <w:t>Optimized regression test execution cycles, successfully driving a 75% reduction in overall regression testing times and enabling faster release cadences.</w:t>
+        <w:rPr>
+          <w:rFonts w:ascii="Calibri" w:hAnsi="Calibri"/>
+          <w:color w:val="5A5A6E"/>
+          <w:sz w:val="21"/>
+        </w:rPr>
+        <w:t>Drove a 75% reduction in regression testing execution times by refactoring legacy manual test cases into optimized automated suites, enabling significantly faster release cadences.</w:t>
       </w:r>
     </w:p>
     <w:p>
       <w:pPr>
         <w:pStyle w:val="ListBullet"/>
+        <w:spacing w:before="20" w:after="20"/>
       </w:pPr>
       <w:r>
-        <w:t>Actively managed end-to-end Software Testing Life Cycle (STLC) processes from requirement analysis to test planning and final execution.</w:t>
+        <w:rPr>
+          <w:rFonts w:ascii="Calibri" w:hAnsi="Calibri"/>
+          <w:color w:val="5A5A6E"/>
+          <w:sz w:val="21"/>
+        </w:rPr>
+        <w:t>Managed end-to-end Software Testing Life Cycle (STLC) — from requirements analysis and test strategy to execution and defect management — across multiple concurrent projects.</w:t>
       </w:r>
     </w:p>
     <w:p>
       <w:pPr>
         <w:pStyle w:val="ListBullet"/>
-      </w:pPr>
-      <w:r>
-        <w:t>Integrated comprehensive test suites directly into Azure DevOps CI/CD pipelines to guarantee automated deployment validation and flawless product deliveries.</w:t>
-      </w:r>
-    </w:p>
-    <w:p>
-      <w:pPr>
-        <w:pBdr>
-          <w:bottom w:val="single" w:sz="6" w:space="1" w:color="auto"/>
-        </w:pBdr>
+        <w:spacing w:before="20" w:after="20"/>
       </w:pPr>
       <w:r>
         <w:rPr>
-          <w:b/>
-          <w:color w:val="000000"/>
-          <w:sz w:val="28"/>
+          <w:rFonts w:ascii="Calibri" w:hAnsi="Calibri"/>
+          <w:color w:val="5A5A6E"/>
+          <w:sz w:val="21"/>
         </w:rPr>
-        <w:t>CERTIFICATIONS &amp; AWARDS</w:t>
+        <w:t>Integrated comprehensive automated test suites into Azure DevOps CI/CD pipelines, enabling continuous validation on every commit and guaranteeing zero-defect production deployments.</w:t>
       </w:r>
     </w:p>
     <w:p>
       <w:pPr>
         <w:pStyle w:val="ListBullet"/>
+        <w:spacing w:before="20" w:after="20"/>
       </w:pPr>
       <w:r>
-        <w:t>Certifications: AZ-900 (Microsoft Azure Fundamentals), Playwright Automation, Selenium Masterclass, Ready API, and Generative AI for Software Testing.</w:t>
+        <w:rPr>
+          <w:rFonts w:ascii="Calibri" w:hAnsi="Calibri"/>
+          <w:color w:val="5A5A6E"/>
+          <w:sz w:val="21"/>
+        </w:rPr>
+        <w:t>Performed rigorous API validation of RESTful and SOAP services using Ready API and Postman, ensuring data integrity and security compliance across microservices architecture.</w:t>
+      </w:r>
+    </w:p>
+    <w:p>
+      <w:pPr>
+        <w:spacing w:before="200" w:after="80"/>
+        <w:pBdr>
+          <w:bottom w:val="single" w:sz="4" w:space="4" w:color="009688"/>
+        </w:pBdr>
+      </w:pPr>
+      <w:r>
+        <w:rPr>
+          <w:rFonts w:ascii="Calibri" w:hAnsi="Calibri"/>
+          <w:b/>
+          <w:color w:val="009688"/>
+          <w:sz w:val="24"/>
+          <w:spacing w:val="60"/>
+        </w:rPr>
+        <w:t>CERTIFICATIONS</w:t>
       </w:r>
     </w:p>
     <w:p>
       <w:pPr>
         <w:pStyle w:val="ListBullet"/>
+        <w:spacing w:before="20" w:after="20"/>
       </w:pPr>
       <w:r>
-        <w:t>Awards: Shooting Star Award, Team Player Award, and Super Crew Award recognized by leadership and clients for outstanding project deliveries and profound technical impact.</w:t>
+        <w:rPr>
+          <w:rFonts w:ascii="Calibri" w:hAnsi="Calibri"/>
+          <w:color w:val="5A5A6E"/>
+          <w:sz w:val="21"/>
+        </w:rPr>
+        <w:t>Microsoft Azure Fundamentals (AZ-900)</w:t>
+      </w:r>
+    </w:p>
+    <w:p>
+      <w:pPr>
+        <w:pStyle w:val="ListBullet"/>
+        <w:spacing w:before="20" w:after="20"/>
+      </w:pPr>
+      <w:r>
+        <w:rPr>
+          <w:rFonts w:ascii="Calibri" w:hAnsi="Calibri"/>
+          <w:color w:val="5A5A6E"/>
+          <w:sz w:val="21"/>
+        </w:rPr>
+        <w:t>Playwright Automation — Advanced Test Framework Design</w:t>
+      </w:r>
+    </w:p>
+    <w:p>
+      <w:pPr>
+        <w:pStyle w:val="ListBullet"/>
+        <w:spacing w:before="20" w:after="20"/>
+      </w:pPr>
+      <w:r>
+        <w:rPr>
+          <w:rFonts w:ascii="Calibri" w:hAnsi="Calibri"/>
+          <w:color w:val="5A5A6E"/>
+          <w:sz w:val="21"/>
+        </w:rPr>
+        <w:t>Selenium WebDriver Masterclass — Enterprise Automation</w:t>
+      </w:r>
+    </w:p>
+    <w:p>
+      <w:pPr>
+        <w:pStyle w:val="ListBullet"/>
+        <w:spacing w:before="20" w:after="20"/>
+      </w:pPr>
+      <w:r>
+        <w:rPr>
+          <w:rFonts w:ascii="Calibri" w:hAnsi="Calibri"/>
+          <w:color w:val="5A5A6E"/>
+          <w:sz w:val="21"/>
+        </w:rPr>
+        <w:t>Ready API — RESTful &amp; SOAP Service Validation</w:t>
+      </w:r>
+    </w:p>
+    <w:p>
+      <w:pPr>
+        <w:pStyle w:val="ListBullet"/>
+        <w:spacing w:before="20" w:after="20"/>
+      </w:pPr>
+      <w:r>
+        <w:rPr>
+          <w:rFonts w:ascii="Calibri" w:hAnsi="Calibri"/>
+          <w:color w:val="5A5A6E"/>
+          <w:sz w:val="21"/>
+        </w:rPr>
+        <w:t>Generative AI for Software Testing &amp; Quality Engineering</w:t>
+      </w:r>
+    </w:p>
+    <w:p>
+      <w:pPr>
+        <w:spacing w:before="200" w:after="80"/>
+        <w:pBdr>
+          <w:bottom w:val="single" w:sz="4" w:space="4" w:color="009688"/>
+        </w:pBdr>
+      </w:pPr>
+      <w:r>
+        <w:rPr>
+          <w:rFonts w:ascii="Calibri" w:hAnsi="Calibri"/>
+          <w:b/>
+          <w:color w:val="009688"/>
+          <w:sz w:val="24"/>
+          <w:spacing w:val="60"/>
+        </w:rPr>
+        <w:t>AWARDS &amp; RECOGNITION</w:t>
+      </w:r>
+    </w:p>
+    <w:p>
+      <w:pPr>
+        <w:pStyle w:val="ListBullet"/>
+        <w:spacing w:before="20" w:after="20"/>
+      </w:pPr>
+      <w:r>
+        <w:rPr>
+          <w:rFonts w:ascii="Calibri" w:hAnsi="Calibri"/>
+          <w:b/>
+          <w:color w:val="0F0F0F"/>
+          <w:sz w:val="21"/>
+        </w:rPr>
+        <w:t>Shooting Star Award</w:t>
+      </w:r>
+      <w:r>
+        <w:rPr>
+          <w:rFonts w:ascii="Calibri" w:hAnsi="Calibri"/>
+          <w:color w:val="5A5A6E"/>
+          <w:sz w:val="21"/>
+        </w:rPr>
+        <w:t xml:space="preserve"> — Recognized for exceptional individual contributions and rapid skill development.</w:t>
+      </w:r>
+    </w:p>
+    <w:p>
+      <w:pPr>
+        <w:pStyle w:val="ListBullet"/>
+        <w:spacing w:before="20" w:after="20"/>
+      </w:pPr>
+      <w:r>
+        <w:rPr>
+          <w:rFonts w:ascii="Calibri" w:hAnsi="Calibri"/>
+          <w:b/>
+          <w:color w:val="0F0F0F"/>
+          <w:sz w:val="21"/>
+        </w:rPr>
+        <w:t>Team Player Award</w:t>
+      </w:r>
+      <w:r>
+        <w:rPr>
+          <w:rFonts w:ascii="Calibri" w:hAnsi="Calibri"/>
+          <w:color w:val="5A5A6E"/>
+          <w:sz w:val="21"/>
+        </w:rPr>
+        <w:t xml:space="preserve"> — Acknowledged for outstanding cross-functional collaboration and team leadership.</w:t>
+      </w:r>
+    </w:p>
+    <w:p>
+      <w:pPr>
+        <w:pStyle w:val="ListBullet"/>
+        <w:spacing w:before="20" w:after="20"/>
+      </w:pPr>
+      <w:r>
+        <w:rPr>
+          <w:rFonts w:ascii="Calibri" w:hAnsi="Calibri"/>
+          <w:b/>
+          <w:color w:val="0F0F0F"/>
+          <w:sz w:val="21"/>
+        </w:rPr>
+        <w:t>Super Crew Award</w:t>
+      </w:r>
+      <w:r>
+        <w:rPr>
+          <w:rFonts w:ascii="Calibri" w:hAnsi="Calibri"/>
+          <w:color w:val="5A5A6E"/>
+          <w:sz w:val="21"/>
+        </w:rPr>
+        <w:t xml:space="preserve"> — Honored for consistent client appreciation and delivering beyond expectations.</w:t>
       </w:r>
     </w:p>
     <w:sectPr>
       <w:pgSz w:w="12240" w:h="15840"/>
-      <w:pgMar w:top="720" w:right="1080" w:bottom="720" w:left="1080" w:header="720" w:footer="720" w:gutter="0"/>
+      <w:pgMar w:top="576" w:right="1008" w:bottom="576" w:left="1008" w:header="720" w:footer="720" w:gutter="0"/>
       <w:cols w:space="720"/>
       <w:docGrid w:linePitch="360"/>
     </w:sectPr>
@@ -647,7 +1038,7 @@
     <w:rsid w:val="00FC693F"/>
     <w:rPr>
       <w:rFonts w:ascii="Calibri" w:hAnsi="Calibri"/>
-      <w:sz w:val="22"/>
+      <w:sz w:val="21"/>
     </w:rPr>
   </w:style>
   <w:style w:type="paragraph" w:styleId="Header">

</xml_diff>